<commit_message>
Revise project report links
</commit_message>
<xml_diff>
--- a/reports/Metin_Batin_Dincer_221307021_Kitap_Satis_Sitesi_Proje_Raporu.docx
+++ b/reports/Metin_Batin_Dincer_221307021_Kitap_Satis_Sitesi_Proje_Raporu.docx
@@ -4,7 +4,7 @@
   <w:body>
     <w:p>
       <w:pPr>
-        <w:spacing w:after="160"/>
+        <w:spacing w:after="120"/>
         <w:jc w:val="center"/>
       </w:pPr>
       <w:r>
@@ -18,7 +18,7 @@
     </w:p>
     <w:p>
       <w:pPr>
-        <w:spacing w:after="200"/>
+        <w:spacing w:after="140"/>
         <w:jc w:val="center"/>
       </w:pPr>
       <w:r>
@@ -39,14 +39,14 @@
         <w:rPr>
           <w:rFonts w:ascii="Times New Roman" w:hAnsi="Times New Roman" w:cs="Times New Roman"/>
           <w:b/>
-          <w:sz w:val="19"/>
+          <w:sz w:val="18"/>
         </w:rPr>
         <w:t xml:space="preserve">Ad Soyad: </w:t>
       </w:r>
       <w:r>
         <w:rPr>
           <w:rFonts w:ascii="Times New Roman" w:hAnsi="Times New Roman" w:cs="Times New Roman"/>
-          <w:sz w:val="19"/>
+          <w:sz w:val="18"/>
         </w:rPr>
         <w:t>Metin Batın Dincer</w:t>
       </w:r>
@@ -60,14 +60,14 @@
         <w:rPr>
           <w:rFonts w:ascii="Times New Roman" w:hAnsi="Times New Roman" w:cs="Times New Roman"/>
           <w:b/>
-          <w:sz w:val="19"/>
+          <w:sz w:val="18"/>
         </w:rPr>
         <w:t xml:space="preserve">Öğrenci No: </w:t>
       </w:r>
       <w:r>
         <w:rPr>
           <w:rFonts w:ascii="Times New Roman" w:hAnsi="Times New Roman" w:cs="Times New Roman"/>
-          <w:sz w:val="19"/>
+          <w:sz w:val="18"/>
         </w:rPr>
         <w:t>221307021</w:t>
       </w:r>
@@ -81,14 +81,14 @@
         <w:rPr>
           <w:rFonts w:ascii="Times New Roman" w:hAnsi="Times New Roman" w:cs="Times New Roman"/>
           <w:b/>
-          <w:sz w:val="19"/>
+          <w:sz w:val="18"/>
         </w:rPr>
         <w:t xml:space="preserve">Ders: </w:t>
       </w:r>
       <w:r>
         <w:rPr>
           <w:rFonts w:ascii="Times New Roman" w:hAnsi="Times New Roman" w:cs="Times New Roman"/>
-          <w:sz w:val="19"/>
+          <w:sz w:val="18"/>
         </w:rPr>
         <w:t>Web Programlama</w:t>
       </w:r>
@@ -102,14 +102,14 @@
         <w:rPr>
           <w:rFonts w:ascii="Times New Roman" w:hAnsi="Times New Roman" w:cs="Times New Roman"/>
           <w:b/>
-          <w:sz w:val="19"/>
+          <w:sz w:val="18"/>
         </w:rPr>
         <w:t xml:space="preserve">Bölüm: </w:t>
       </w:r>
       <w:r>
         <w:rPr>
           <w:rFonts w:ascii="Times New Roman" w:hAnsi="Times New Roman" w:cs="Times New Roman"/>
-          <w:sz w:val="19"/>
+          <w:sz w:val="18"/>
         </w:rPr>
         <w:t>Bilişim Sistemleri Mühendisliği</w:t>
       </w:r>
@@ -123,19 +123,52 @@
         <w:rPr>
           <w:rFonts w:ascii="Times New Roman" w:hAnsi="Times New Roman" w:cs="Times New Roman"/>
           <w:b/>
-          <w:sz w:val="19"/>
+          <w:sz w:val="18"/>
         </w:rPr>
         <w:t xml:space="preserve">GitHub: </w:t>
       </w:r>
       <w:r>
         <w:rPr>
           <w:rFonts w:ascii="Times New Roman" w:hAnsi="Times New Roman" w:cs="Times New Roman"/>
-          <w:sz w:val="19"/>
+          <w:sz w:val="18"/>
         </w:rPr>
         <w:t>https://github.com/MetinBatinDincer/php_book_sales_web</w:t>
       </w:r>
     </w:p>
-    <w:p/>
+    <w:p>
+      <w:pPr>
+        <w:spacing w:after="20"/>
+        <w:jc w:val="center"/>
+      </w:pPr>
+      <w:r>
+        <w:rPr>
+          <w:rFonts w:ascii="Times New Roman" w:hAnsi="Times New Roman" w:cs="Times New Roman"/>
+          <w:b/>
+          <w:sz w:val="18"/>
+        </w:rPr>
+        <w:t xml:space="preserve">Drive: </w:t>
+      </w:r>
+      <w:r>
+        <w:rPr>
+          <w:rFonts w:ascii="Times New Roman" w:hAnsi="Times New Roman" w:cs="Times New Roman"/>
+          <w:sz w:val="18"/>
+        </w:rPr>
+        <w:t>https://drive.google.com/drive/folders/1zVjE4mKre9XCgM86UnsaBGFXk8JHAtlJ?usp=sharing</w:t>
+      </w:r>
+    </w:p>
+    <w:p>
+      <w:pPr>
+        <w:spacing w:after="40" w:line="259" w:lineRule="auto"/>
+      </w:pPr>
+      <w:r>
+        <w:rPr>
+          <w:rFonts w:ascii="Times New Roman" w:hAnsi="Times New Roman" w:cs="Times New Roman"/>
+          <w:b w:val="0"/>
+          <w:i w:val="0"/>
+          <w:sz w:val="20"/>
+        </w:rPr>
+      </w:r>
+    </w:p>
     <w:p>
       <w:pPr>
         <w:spacing w:after="100"/>
@@ -155,12 +188,12 @@
           <w:i/>
           <w:sz w:val="18"/>
         </w:rPr>
-        <w:t>Bu çalışmada PHP ve MySQL kullanılarak admin paneline sahip, web tabanlı bir kitap satış sitesi geliştirilmiştir. Sistem; kullanıcı kayıt/giriş işlemleri, ürün listeleme, ürün detayı, sepet, ödeme, sipariş takibi, sipariş iptali, bakiye iadesi ve yönetici tarafında ürün, kullanıcı ve sipariş yönetimi işlevlerini kapsamaktadır. Uygulama saf PHP ile MVC mantığına yakın biçimde düzenlenmiş, PDO ile veritabanı işlemleri hazırlanmış ve Bootstrap destekli responsive arayüz ile sunulmuştur.</w:t>
+        <w:t>Bu projede PHP ve MySQL kullanılarak admin paneline sahip, web tabanlı bir kitap satış sitesi geliştirilmiştir. Sistem; kullanıcı kayıt/giriş işlemleri, ürün listeleme, ürün detay sayfası, sepet, ödeme, sipariş takibi, sipariş iptali, bakiye iadesi ve yönetici tarafında ürün, kullanıcı ve sipariş yönetimi işlevlerini kapsamaktadır. Uygulama saf PHP ile MVC mantığına yakın biçimde düzenlenmiş, PDO ile veritabanı işlemleri hazırlanmış ve Bootstrap destekli responsive arayüz ile sunulmuştur.</w:t>
       </w:r>
     </w:p>
     <w:p>
       <w:pPr>
-        <w:spacing w:after="160"/>
+        <w:spacing w:after="120"/>
       </w:pPr>
       <w:r>
         <w:rPr>
@@ -190,7 +223,7 @@
           <w:i w:val="0"/>
           <w:sz w:val="18"/>
         </w:rPr>
-        <w:t>Tablo 1. Uygulama modülleri ve dosya karşılıkları</w:t>
+        <w:t>Tablo 1. Proje bileşenleri</w:t>
       </w:r>
     </w:p>
     <w:tbl>
@@ -216,11 +249,11 @@
       <w:tr>
         <w:tc>
           <w:tcPr>
-            <w:tcW w:type="dxa" w:w="1700"/>
+            <w:tcW w:type="dxa" w:w="1927"/>
             <w:tcMar>
-              <w:top w:w="70" w:type="dxa"/>
+              <w:top w:w="80" w:type="dxa"/>
               <w:start w:w="90" w:type="dxa"/>
-              <w:bottom w:w="70" w:type="dxa"/>
+              <w:bottom w:w="80" w:type="dxa"/>
               <w:end w:w="90" w:type="dxa"/>
             </w:tcMar>
             <w:shd w:fill="E7EEF8"/>
@@ -235,19 +268,19 @@
               <w:rPr>
                 <w:rFonts w:ascii="Times New Roman" w:hAnsi="Times New Roman" w:cs="Times New Roman"/>
                 <w:b/>
-                <w:sz w:val="17"/>
+                <w:sz w:val="16"/>
               </w:rPr>
-              <w:t>Modül</w:t>
+              <w:t>Bileşen</w:t>
             </w:r>
           </w:p>
         </w:tc>
         <w:tc>
           <w:tcPr>
-            <w:tcW w:type="dxa" w:w="4025"/>
+            <w:tcW w:type="dxa" w:w="4648"/>
             <w:tcMar>
-              <w:top w:w="70" w:type="dxa"/>
+              <w:top w:w="80" w:type="dxa"/>
               <w:start w:w="90" w:type="dxa"/>
-              <w:bottom w:w="70" w:type="dxa"/>
+              <w:bottom w:w="80" w:type="dxa"/>
               <w:end w:w="90" w:type="dxa"/>
             </w:tcMar>
             <w:shd w:fill="E7EEF8"/>
@@ -262,19 +295,19 @@
               <w:rPr>
                 <w:rFonts w:ascii="Times New Roman" w:hAnsi="Times New Roman" w:cs="Times New Roman"/>
                 <w:b/>
-                <w:sz w:val="17"/>
+                <w:sz w:val="16"/>
               </w:rPr>
-              <w:t>Görevi</w:t>
+              <w:t>Açıklama</w:t>
             </w:r>
           </w:p>
         </w:tc>
         <w:tc>
           <w:tcPr>
-            <w:tcW w:type="dxa" w:w="2551"/>
+            <w:tcW w:type="dxa" w:w="2607"/>
             <w:tcMar>
-              <w:top w:w="70" w:type="dxa"/>
+              <w:top w:w="80" w:type="dxa"/>
               <w:start w:w="90" w:type="dxa"/>
-              <w:bottom w:w="70" w:type="dxa"/>
+              <w:bottom w:w="80" w:type="dxa"/>
               <w:end w:w="90" w:type="dxa"/>
             </w:tcMar>
             <w:shd w:fill="E7EEF8"/>
@@ -289,9 +322,9 @@
               <w:rPr>
                 <w:rFonts w:ascii="Times New Roman" w:hAnsi="Times New Roman" w:cs="Times New Roman"/>
                 <w:b/>
-                <w:sz w:val="17"/>
+                <w:sz w:val="16"/>
               </w:rPr>
-              <w:t>İlgili Dosyalar</w:t>
+              <w:t>Dosya/Klasör</w:t>
             </w:r>
           </w:p>
         </w:tc>
@@ -299,11 +332,11 @@
       <w:tr>
         <w:tc>
           <w:tcPr>
-            <w:tcW w:type="dxa" w:w="1700"/>
+            <w:tcW w:type="dxa" w:w="1927"/>
             <w:tcMar>
-              <w:top w:w="70" w:type="dxa"/>
+              <w:top w:w="80" w:type="dxa"/>
               <w:start w:w="90" w:type="dxa"/>
-              <w:bottom w:w="70" w:type="dxa"/>
+              <w:bottom w:w="80" w:type="dxa"/>
               <w:end w:w="90" w:type="dxa"/>
             </w:tcMar>
             <w:vAlign w:val="center"/>
@@ -325,11 +358,11 @@
         </w:tc>
         <w:tc>
           <w:tcPr>
-            <w:tcW w:type="dxa" w:w="4025"/>
+            <w:tcW w:type="dxa" w:w="4648"/>
             <w:tcMar>
-              <w:top w:w="70" w:type="dxa"/>
+              <w:top w:w="80" w:type="dxa"/>
               <w:start w:w="90" w:type="dxa"/>
-              <w:bottom w:w="70" w:type="dxa"/>
+              <w:bottom w:w="80" w:type="dxa"/>
               <w:end w:w="90" w:type="dxa"/>
             </w:tcMar>
             <w:vAlign w:val="center"/>
@@ -345,17 +378,17 @@
                 <w:b w:val="0"/>
                 <w:sz w:val="16"/>
               </w:rPr>
-              <w:t>Kayıt, giriş, profil, şifre ve hesap durumu işlemlerini yönetir.</w:t>
+              <w:t>Kayıt, giriş, profil ve sipariş takibi işlemleri.</w:t>
             </w:r>
           </w:p>
         </w:tc>
         <w:tc>
           <w:tcPr>
-            <w:tcW w:type="dxa" w:w="2551"/>
+            <w:tcW w:type="dxa" w:w="2607"/>
             <w:tcMar>
-              <w:top w:w="70" w:type="dxa"/>
+              <w:top w:w="80" w:type="dxa"/>
               <w:start w:w="90" w:type="dxa"/>
-              <w:bottom w:w="70" w:type="dxa"/>
+              <w:bottom w:w="80" w:type="dxa"/>
               <w:end w:w="90" w:type="dxa"/>
             </w:tcMar>
             <w:vAlign w:val="center"/>
@@ -371,7 +404,7 @@
                 <w:b w:val="0"/>
                 <w:sz w:val="16"/>
               </w:rPr>
-              <w:t>User.php, login.php, profile.php</w:t>
+              <w:t>app/models/User.php, app/views</w:t>
             </w:r>
           </w:p>
         </w:tc>
@@ -379,11 +412,11 @@
       <w:tr>
         <w:tc>
           <w:tcPr>
-            <w:tcW w:type="dxa" w:w="1700"/>
+            <w:tcW w:type="dxa" w:w="1927"/>
             <w:tcMar>
-              <w:top w:w="70" w:type="dxa"/>
+              <w:top w:w="80" w:type="dxa"/>
               <w:start w:w="90" w:type="dxa"/>
-              <w:bottom w:w="70" w:type="dxa"/>
+              <w:bottom w:w="80" w:type="dxa"/>
               <w:end w:w="90" w:type="dxa"/>
             </w:tcMar>
             <w:vAlign w:val="center"/>
@@ -405,11 +438,11 @@
         </w:tc>
         <w:tc>
           <w:tcPr>
-            <w:tcW w:type="dxa" w:w="4025"/>
+            <w:tcW w:type="dxa" w:w="4648"/>
             <w:tcMar>
-              <w:top w:w="70" w:type="dxa"/>
+              <w:top w:w="80" w:type="dxa"/>
               <w:start w:w="90" w:type="dxa"/>
-              <w:bottom w:w="70" w:type="dxa"/>
+              <w:bottom w:w="80" w:type="dxa"/>
               <w:end w:w="90" w:type="dxa"/>
             </w:tcMar>
             <w:vAlign w:val="center"/>
@@ -425,17 +458,17 @@
                 <w:b w:val="0"/>
                 <w:sz w:val="16"/>
               </w:rPr>
-              <w:t>Kitap listeleme, detay görüntüleme, stok ve satış durumu işlemlerini kapsar.</w:t>
+              <w:t>Kitap listeleme, detay görüntüleme, stok ve satış durumu.</w:t>
             </w:r>
           </w:p>
         </w:tc>
         <w:tc>
           <w:tcPr>
-            <w:tcW w:type="dxa" w:w="2551"/>
+            <w:tcW w:type="dxa" w:w="2607"/>
             <w:tcMar>
-              <w:top w:w="70" w:type="dxa"/>
+              <w:top w:w="80" w:type="dxa"/>
               <w:start w:w="90" w:type="dxa"/>
-              <w:bottom w:w="70" w:type="dxa"/>
+              <w:bottom w:w="80" w:type="dxa"/>
               <w:end w:w="90" w:type="dxa"/>
             </w:tcMar>
             <w:vAlign w:val="center"/>
@@ -451,7 +484,7 @@
                 <w:b w:val="0"/>
                 <w:sz w:val="16"/>
               </w:rPr>
-              <w:t>Product.php, home.php, product.php</w:t>
+              <w:t>app/models/Product.php</w:t>
             </w:r>
           </w:p>
         </w:tc>
@@ -459,11 +492,11 @@
       <w:tr>
         <w:tc>
           <w:tcPr>
-            <w:tcW w:type="dxa" w:w="1700"/>
+            <w:tcW w:type="dxa" w:w="1927"/>
             <w:tcMar>
-              <w:top w:w="70" w:type="dxa"/>
+              <w:top w:w="80" w:type="dxa"/>
               <w:start w:w="90" w:type="dxa"/>
-              <w:bottom w:w="70" w:type="dxa"/>
+              <w:bottom w:w="80" w:type="dxa"/>
               <w:end w:w="90" w:type="dxa"/>
             </w:tcMar>
             <w:vAlign w:val="center"/>
@@ -479,17 +512,17 @@
                 <w:b w:val="0"/>
                 <w:sz w:val="16"/>
               </w:rPr>
-              <w:t>Sepet/Sipariş</w:t>
+              <w:t>Sipariş</w:t>
             </w:r>
           </w:p>
         </w:tc>
         <w:tc>
           <w:tcPr>
-            <w:tcW w:type="dxa" w:w="4025"/>
+            <w:tcW w:type="dxa" w:w="4648"/>
             <w:tcMar>
-              <w:top w:w="70" w:type="dxa"/>
+              <w:top w:w="80" w:type="dxa"/>
               <w:start w:w="90" w:type="dxa"/>
-              <w:bottom w:w="70" w:type="dxa"/>
+              <w:bottom w:w="80" w:type="dxa"/>
               <w:end w:w="90" w:type="dxa"/>
             </w:tcMar>
             <w:vAlign w:val="center"/>
@@ -505,17 +538,17 @@
                 <w:b w:val="0"/>
                 <w:sz w:val="16"/>
               </w:rPr>
-              <w:t>Sepet, ödeme, sipariş oluşturma, iptal ve teslimat takibi süreçlerini yürütür.</w:t>
+              <w:t>Sepet, ödeme, iptal, bakiye ve teslimat süreci.</w:t>
             </w:r>
           </w:p>
         </w:tc>
         <w:tc>
           <w:tcPr>
-            <w:tcW w:type="dxa" w:w="2551"/>
+            <w:tcW w:type="dxa" w:w="2607"/>
             <w:tcMar>
-              <w:top w:w="70" w:type="dxa"/>
+              <w:top w:w="80" w:type="dxa"/>
               <w:start w:w="90" w:type="dxa"/>
-              <w:bottom w:w="70" w:type="dxa"/>
+              <w:bottom w:w="80" w:type="dxa"/>
               <w:end w:w="90" w:type="dxa"/>
             </w:tcMar>
             <w:vAlign w:val="center"/>
@@ -531,7 +564,7 @@
                 <w:b w:val="0"/>
                 <w:sz w:val="16"/>
               </w:rPr>
-              <w:t>Order.php, cart.php, checkout.php, orders.php</w:t>
+              <w:t>app/models/Order.php</w:t>
             </w:r>
           </w:p>
         </w:tc>
@@ -539,11 +572,11 @@
       <w:tr>
         <w:tc>
           <w:tcPr>
-            <w:tcW w:type="dxa" w:w="1700"/>
+            <w:tcW w:type="dxa" w:w="1927"/>
             <w:tcMar>
-              <w:top w:w="70" w:type="dxa"/>
+              <w:top w:w="80" w:type="dxa"/>
               <w:start w:w="90" w:type="dxa"/>
-              <w:bottom w:w="70" w:type="dxa"/>
+              <w:bottom w:w="80" w:type="dxa"/>
               <w:end w:w="90" w:type="dxa"/>
             </w:tcMar>
             <w:vAlign w:val="center"/>
@@ -559,17 +592,17 @@
                 <w:b w:val="0"/>
                 <w:sz w:val="16"/>
               </w:rPr>
-              <w:t>Admin Paneli</w:t>
+              <w:t>Veritabanı</w:t>
             </w:r>
           </w:p>
         </w:tc>
         <w:tc>
           <w:tcPr>
-            <w:tcW w:type="dxa" w:w="4025"/>
+            <w:tcW w:type="dxa" w:w="4648"/>
             <w:tcMar>
-              <w:top w:w="70" w:type="dxa"/>
+              <w:top w:w="80" w:type="dxa"/>
               <w:start w:w="90" w:type="dxa"/>
-              <w:bottom w:w="70" w:type="dxa"/>
+              <w:bottom w:w="80" w:type="dxa"/>
               <w:end w:w="90" w:type="dxa"/>
             </w:tcMar>
             <w:vAlign w:val="center"/>
@@ -585,17 +618,17 @@
                 <w:b w:val="0"/>
                 <w:sz w:val="16"/>
               </w:rPr>
-              <w:t>Ürün, kullanıcı ve sipariş süreçlerinin yönetici tarafından kontrol edilmesini sağlar.</w:t>
+              <w:t>Tablolar, örnek kullanıcılar ve kitap verileri.</w:t>
             </w:r>
           </w:p>
         </w:tc>
         <w:tc>
           <w:tcPr>
-            <w:tcW w:type="dxa" w:w="2551"/>
+            <w:tcW w:type="dxa" w:w="2607"/>
             <w:tcMar>
-              <w:top w:w="70" w:type="dxa"/>
+              <w:top w:w="80" w:type="dxa"/>
               <w:start w:w="90" w:type="dxa"/>
-              <w:bottom w:w="70" w:type="dxa"/>
+              <w:bottom w:w="80" w:type="dxa"/>
               <w:end w:w="90" w:type="dxa"/>
             </w:tcMar>
             <w:vAlign w:val="center"/>
@@ -611,7 +644,7 @@
                 <w:b w:val="0"/>
                 <w:sz w:val="16"/>
               </w:rPr>
-              <w:t>dashboard.php, product_form.php, user_form.php</w:t>
+              <w:t>database/book_sales.sql</w:t>
             </w:r>
           </w:p>
         </w:tc>
@@ -621,7 +654,7 @@
       <w:pPr>
         <w:sectPr>
           <w:pgSz w:w="11906" w:h="16838"/>
-          <w:pgMar w:top="1134" w:right="1020" w:bottom="1134" w:left="1020" w:header="720" w:footer="720" w:gutter="0"/>
+          <w:pgMar w:top="1020" w:right="1020" w:bottom="1020" w:left="1020" w:header="720" w:footer="720" w:gutter="0"/>
           <w:cols w:space="720"/>
           <w:docGrid w:linePitch="360"/>
         </w:sectPr>
@@ -670,23 +703,7 @@
           <w:i w:val="0"/>
           <w:sz w:val="20"/>
         </w:rPr>
-        <w:t>Projenin amacı, Web Programlama dersi kapsamında PHP oturum yönetimi, veritabanı bağlantısı, form işlemleri, CRUD ekranları ve kullanıcı etkileşimlerini gerçekçi bir uygulama üzerinde göstermektir. Sistem, yerel sunucuda çalıştırılabilecek şekilde düzenlenmiş ve veritabanı yedeğiyle birlikte teslim edilebilir hale getirilmiştir.</w:t>
-      </w:r>
-    </w:p>
-    <w:p>
-      <w:pPr>
-        <w:spacing w:after="80" w:line="259" w:lineRule="auto"/>
-        <w:ind w:firstLine="198"/>
-        <w:jc w:val="both"/>
-      </w:pPr>
-      <w:r>
-        <w:rPr>
-          <w:rFonts w:ascii="Times New Roman" w:hAnsi="Times New Roman" w:cs="Times New Roman"/>
-          <w:b w:val="0"/>
-          <w:i w:val="0"/>
-          <w:sz w:val="20"/>
-        </w:rPr>
-        <w:t>Uygulamada kullanıcı tarafında kitap inceleme ve satın alma akışı, yönetici tarafında ise ürün ve sipariş yönetimi öne çıkarılmıştır. Böylece yalnızca statik sayfalardan oluşan bir örnek yerine, veritabanı ile ilişkili dinamik bir web uygulaması ortaya konmuştur.</w:t>
+        <w:t>Projenin amacı, Web Programlama dersi kapsamında PHP oturum yönetimi, veritabanı bağlantısı, form işlemleri, CRUD ekranları ve kullanıcı etkileşimlerini çalışan bir uygulama üzerinde göstermektir. Proje yerel sunucuda kurulabilir durumdadır ve veritabanı yedeğiyle birlikte teslim edilmiştir.</w:t>
       </w:r>
     </w:p>
     <w:p>
@@ -748,7 +765,7 @@
           <w:i w:val="0"/>
           <w:sz w:val="20"/>
         </w:rPr>
-        <w:t>Bootstrap ve özel CSS dosyası, arayüzün farklı ekran boyutlarında düzenli görünmesi için kullanılmıştır. Ürün kartları, formlar, admin paneli, sepet ve sipariş sayfaları aynı görsel çizgiyi koruyacak şekilde hazırlanmıştır.</w:t>
+        <w:t>Bootstrap ve özel CSS dosyası arayüzün farklı ekran boyutlarında düzenli görünmesini sağlar. Ürün kartları, formlar, admin paneli, sepet ve sipariş sayfaları aynı görsel çizgiyi koruyacak şekilde hazırlanmıştır.</w:t>
       </w:r>
     </w:p>
     <w:p>
@@ -840,7 +857,7 @@
           <w:i w:val="0"/>
           <w:sz w:val="20"/>
         </w:rPr>
-        <w:t>Veritabanı dört ana tablodan oluşmaktadır: users, products, orders ve order_items. Kullanıcılar sipariş oluşturur, siparişler birden fazla sipariş kalemi içerir ve her kalem ilgili ürünle ilişkilendirilir.</w:t>
+        <w:t>Veritabanı users, products, orders ve order_items tabloları üzerine kurulmuştur. Kullanıcılar sipariş oluşturur, siparişler birden fazla sipariş kalemi içerir ve her kalem ilgili ürünle ilişkilendirilir.</w:t>
       </w:r>
     </w:p>
     <w:p>
@@ -856,7 +873,7 @@
           <w:i w:val="0"/>
           <w:sz w:val="20"/>
         </w:rPr>
-        <w:t>users tablosunda kullanıcı bilgileri, rol, hesap durumu ve site bakiyesi tutulur. products tablosu kitap adı, yazar, açıklama, fiyat, stok ve satış durumu bilgilerini içerir. orders tablosunda sipariş toplamı, kullanılan bakiye, kart ödemesi, adres ve süreç durumu yer alır. order_items tablosu ise siparişe bağlı kitap satırlarını, adetleri ve birim fiyatları saklar.</w:t>
+        <w:t>users tablosunda kullanıcı bilgileri, rol, hesap durumu ve site bakiyesi tutulur. products tablosu kitap adı, yazar, açıklama, fiyat, stok ve satış durumu bilgilerini içerir. orders tablosunda sipariş toplamı, kullanılan bakiye, kart ödemesi, adres ve süreç durumu yer alır.</w:t>
       </w:r>
     </w:p>
     <w:p>
@@ -872,7 +889,7 @@
           <w:i w:val="0"/>
           <w:sz w:val="20"/>
         </w:rPr>
-        <w:t>Bu yapı ile sipariş geçmişi ürün bilgilerinden bağımsız olarak korunabilir. Sipariş kalemlerinde ürün başlığı ve birim fiyat bilgisinin ayrıca tutulması, ürün sonradan değişse bile geçmiş siparişin doğru görüntülenmesini sağlar.</w:t>
+        <w:t>Sipariş kalemlerinde ürün başlığı ve birim fiyat bilgisinin ayrıca tutulması, ürün bilgisi sonradan değişse bile geçmiş siparişin doğru görüntülenmesini sağlar. Bu yapı hem kullanıcı sipariş geçmişi hem de admin takibi açısından düzenli bir veri modeli sunar.</w:t>
       </w:r>
     </w:p>
     <w:p>
@@ -934,7 +951,7 @@
           <w:i w:val="0"/>
           <w:sz w:val="20"/>
         </w:rPr>
-        <w:t>Bu ayrım, tekrar eden kodu azaltır ve uygulamanın bakımını kolaylaştırır. Veri erişimi modellerde, arayüz HTML/PHP view dosyalarında, yönlendirme ve işlem akışı ise front controller dosyasında toplanmıştır.</w:t>
+        <w:t>Bu ayrım tekrar eden kodu azaltır ve uygulamanın bakımını kolaylaştırır. Veri erişimi modellerde, arayüz HTML/PHP view dosyalarında, yönlendirme ve işlem akışı ise front controller dosyasında toplanmıştır.</w:t>
       </w:r>
     </w:p>
     <w:p>
@@ -1110,22 +1127,6 @@
     <w:p>
       <w:pPr>
         <w:spacing w:after="80" w:line="259" w:lineRule="auto"/>
-        <w:ind w:firstLine="198"/>
-        <w:jc w:val="both"/>
-      </w:pPr>
-      <w:r>
-        <w:rPr>
-          <w:rFonts w:ascii="Times New Roman" w:hAnsi="Times New Roman" w:cs="Times New Roman"/>
-          <w:b w:val="0"/>
-          <w:i w:val="0"/>
-          <w:sz w:val="20"/>
-        </w:rPr>
-        <w:t>Arayüz tarafında ana sayfa, ürün detay sayfası, sepet, ödeme, profil, sipariş listesi ve admin paneli ekranları kontrol edilmiştir. Bootstrap kullanımı sayesinde sayfalar masaüstü ve daha dar ekranlarda okunabilir biçimde görüntülenmektedir.</w:t>
-      </w:r>
-    </w:p>
-    <w:p>
-      <w:pPr>
-        <w:spacing w:after="80" w:line="259" w:lineRule="auto"/>
       </w:pPr>
       <w:r>
         <w:rPr>
@@ -1151,22 +1152,6 @@
           <w:sz w:val="20"/>
         </w:rPr>
         <w:t>Geliştirilen kitap satış sitesi, Web Programlama dersi için istenen temel web uygulaması özelliklerini karşılayan çalışır bir proje olarak hazırlanmıştır. Projede kullanıcı ve admin rolleri, ürün yönetimi, sepet, sipariş, bakiye iadesi ve sipariş takip süreçleri birlikte ele alınmıştır.</w:t>
-      </w:r>
-    </w:p>
-    <w:p>
-      <w:pPr>
-        <w:spacing w:after="80" w:line="259" w:lineRule="auto"/>
-        <w:ind w:firstLine="198"/>
-        <w:jc w:val="both"/>
-      </w:pPr>
-      <w:r>
-        <w:rPr>
-          <w:rFonts w:ascii="Times New Roman" w:hAnsi="Times New Roman" w:cs="Times New Roman"/>
-          <w:b w:val="0"/>
-          <w:i w:val="0"/>
-          <w:sz w:val="20"/>
-        </w:rPr>
-        <w:t>Bu çalışma sayesinde PHP ile oturum yönetimi, PDO ile veritabanı işlemleri, rol tabanlı erişim, stok kontrolü, sipariş durum tasarımı ve responsive arayüz geliştirme konularında uygulamalı deneyim kazanılmıştır.</w:t>
       </w:r>
     </w:p>
     <w:p>
@@ -1252,13 +1237,27 @@
           <w:i w:val="0"/>
           <w:sz w:val="20"/>
         </w:rPr>
-        <w:t>[4] Proje kaynak kodu: https://github.com/MetinBatinDincer/php_book_sales_web</w:t>
+        <w:t>[4] GitHub kaynak kodu: https://github.com/MetinBatinDincer/php_book_sales_web</w:t>
+      </w:r>
+    </w:p>
+    <w:p>
+      <w:pPr>
+        <w:spacing w:after="80" w:line="259" w:lineRule="auto"/>
+      </w:pPr>
+      <w:r>
+        <w:rPr>
+          <w:rFonts w:ascii="Times New Roman" w:hAnsi="Times New Roman" w:cs="Times New Roman"/>
+          <w:b w:val="0"/>
+          <w:i w:val="0"/>
+          <w:sz w:val="20"/>
+        </w:rPr>
+        <w:t>[5] Drive proje klasörü: https://drive.google.com/drive/folders/1zVjE4mKre9XCgM86UnsaBGFXk8JHAtlJ?usp=sharing</w:t>
       </w:r>
     </w:p>
     <w:sectPr>
       <w:type w:val="continuous"/>
       <w:pgSz w:w="11906" w:h="16838"/>
-      <w:pgMar w:top="1134" w:right="1020" w:bottom="1134" w:left="1020" w:header="720" w:footer="720" w:gutter="0"/>
+      <w:pgMar w:top="1020" w:right="1020" w:bottom="1020" w:left="1020" w:header="720" w:footer="720" w:gutter="0"/>
       <w:cols w:space="396" w:num="2"/>
       <w:docGrid w:linePitch="360"/>
     </w:sectPr>

</xml_diff>